<commit_message>
review: publish final BISM2202 packages for independent acceptance
</commit_message>
<xml_diff>
--- a/FINAL_DELIVERABLES/Student_A/BISM2202_Report_A.docx
+++ b/FINAL_DELIVERABLES/Student_A/BISM2202_Report_A.docx
@@ -113,7 +113,7 @@
       <w:r>
         <w:drawing>
           <wp:inline xmlns:a="http://schemas.openxmlformats.org/drawingml/2006/main" xmlns:pic="http://schemas.openxmlformats.org/drawingml/2006/picture">
-            <wp:extent cx="5989320" cy="3496016"/>
+            <wp:extent cx="5989320" cy="3393415"/>
             <wp:docPr id="1" name="Picture 1"/>
             <wp:cNvGraphicFramePr>
               <a:graphicFrameLocks noChangeAspect="1"/>
@@ -134,7 +134,7 @@
                   <pic:spPr>
                     <a:xfrm>
                       <a:off x="0" y="0"/>
-                      <a:ext cx="5989320" cy="3496016"/>
+                      <a:ext cx="5989320" cy="3393415"/>
                     </a:xfrm>
                     <a:prstGeom prst="rect"/>
                   </pic:spPr>
@@ -211,7 +211,7 @@
       <w:r>
         <w:drawing>
           <wp:inline xmlns:a="http://schemas.openxmlformats.org/drawingml/2006/main" xmlns:pic="http://schemas.openxmlformats.org/drawingml/2006/picture">
-            <wp:extent cx="5989320" cy="3496016"/>
+            <wp:extent cx="5989320" cy="3393415"/>
             <wp:docPr id="2" name="Picture 2"/>
             <wp:cNvGraphicFramePr>
               <a:graphicFrameLocks noChangeAspect="1"/>
@@ -232,7 +232,7 @@
                   <pic:spPr>
                     <a:xfrm>
                       <a:off x="0" y="0"/>
-                      <a:ext cx="5989320" cy="3496016"/>
+                      <a:ext cx="5989320" cy="3393415"/>
                     </a:xfrm>
                     <a:prstGeom prst="rect"/>
                   </pic:spPr>
@@ -309,7 +309,7 @@
       <w:r>
         <w:drawing>
           <wp:inline xmlns:a="http://schemas.openxmlformats.org/drawingml/2006/main" xmlns:pic="http://schemas.openxmlformats.org/drawingml/2006/picture">
-            <wp:extent cx="5989320" cy="3496016"/>
+            <wp:extent cx="5989320" cy="3393415"/>
             <wp:docPr id="3" name="Picture 3"/>
             <wp:cNvGraphicFramePr>
               <a:graphicFrameLocks noChangeAspect="1"/>
@@ -330,7 +330,7 @@
                   <pic:spPr>
                     <a:xfrm>
                       <a:off x="0" y="0"/>
-                      <a:ext cx="5989320" cy="3496016"/>
+                      <a:ext cx="5989320" cy="3393415"/>
                     </a:xfrm>
                     <a:prstGeom prst="rect"/>
                   </pic:spPr>
@@ -407,7 +407,7 @@
       <w:r>
         <w:drawing>
           <wp:inline xmlns:a="http://schemas.openxmlformats.org/drawingml/2006/main" xmlns:pic="http://schemas.openxmlformats.org/drawingml/2006/picture">
-            <wp:extent cx="5989320" cy="3496016"/>
+            <wp:extent cx="5989320" cy="3393415"/>
             <wp:docPr id="4" name="Picture 4"/>
             <wp:cNvGraphicFramePr>
               <a:graphicFrameLocks noChangeAspect="1"/>
@@ -428,7 +428,7 @@
                   <pic:spPr>
                     <a:xfrm>
                       <a:off x="0" y="0"/>
-                      <a:ext cx="5989320" cy="3496016"/>
+                      <a:ext cx="5989320" cy="3393415"/>
                     </a:xfrm>
                     <a:prstGeom prst="rect"/>
                   </pic:spPr>
@@ -505,7 +505,7 @@
       <w:r>
         <w:drawing>
           <wp:inline xmlns:a="http://schemas.openxmlformats.org/drawingml/2006/main" xmlns:pic="http://schemas.openxmlformats.org/drawingml/2006/picture">
-            <wp:extent cx="5989320" cy="3496016"/>
+            <wp:extent cx="5989320" cy="3393415"/>
             <wp:docPr id="5" name="Picture 5"/>
             <wp:cNvGraphicFramePr>
               <a:graphicFrameLocks noChangeAspect="1"/>
@@ -526,7 +526,7 @@
                   <pic:spPr>
                     <a:xfrm>
                       <a:off x="0" y="0"/>
-                      <a:ext cx="5989320" cy="3496016"/>
+                      <a:ext cx="5989320" cy="3393415"/>
                     </a:xfrm>
                     <a:prstGeom prst="rect"/>
                   </pic:spPr>
@@ -603,7 +603,7 @@
       <w:r>
         <w:drawing>
           <wp:inline xmlns:a="http://schemas.openxmlformats.org/drawingml/2006/main" xmlns:pic="http://schemas.openxmlformats.org/drawingml/2006/picture">
-            <wp:extent cx="5989320" cy="3496016"/>
+            <wp:extent cx="5989320" cy="3393415"/>
             <wp:docPr id="6" name="Picture 6"/>
             <wp:cNvGraphicFramePr>
               <a:graphicFrameLocks noChangeAspect="1"/>
@@ -624,7 +624,7 @@
                   <pic:spPr>
                     <a:xfrm>
                       <a:off x="0" y="0"/>
-                      <a:ext cx="5989320" cy="3496016"/>
+                      <a:ext cx="5989320" cy="3393415"/>
                     </a:xfrm>
                     <a:prstGeom prst="rect"/>
                   </pic:spPr>
@@ -701,7 +701,7 @@
       <w:r>
         <w:drawing>
           <wp:inline xmlns:a="http://schemas.openxmlformats.org/drawingml/2006/main" xmlns:pic="http://schemas.openxmlformats.org/drawingml/2006/picture">
-            <wp:extent cx="5989320" cy="3496016"/>
+            <wp:extent cx="5989320" cy="3393415"/>
             <wp:docPr id="7" name="Picture 7"/>
             <wp:cNvGraphicFramePr>
               <a:graphicFrameLocks noChangeAspect="1"/>
@@ -722,7 +722,7 @@
                   <pic:spPr>
                     <a:xfrm>
                       <a:off x="0" y="0"/>
-                      <a:ext cx="5989320" cy="3496016"/>
+                      <a:ext cx="5989320" cy="3393415"/>
                     </a:xfrm>
                     <a:prstGeom prst="rect"/>
                   </pic:spPr>
@@ -799,7 +799,7 @@
       <w:r>
         <w:drawing>
           <wp:inline xmlns:a="http://schemas.openxmlformats.org/drawingml/2006/main" xmlns:pic="http://schemas.openxmlformats.org/drawingml/2006/picture">
-            <wp:extent cx="5989320" cy="3496016"/>
+            <wp:extent cx="5989320" cy="3393415"/>
             <wp:docPr id="8" name="Picture 8"/>
             <wp:cNvGraphicFramePr>
               <a:graphicFrameLocks noChangeAspect="1"/>
@@ -820,7 +820,7 @@
                   <pic:spPr>
                     <a:xfrm>
                       <a:off x="0" y="0"/>
-                      <a:ext cx="5989320" cy="3496016"/>
+                      <a:ext cx="5989320" cy="3393415"/>
                     </a:xfrm>
                     <a:prstGeom prst="rect"/>
                   </pic:spPr>
@@ -897,7 +897,7 @@
       <w:r>
         <w:drawing>
           <wp:inline xmlns:a="http://schemas.openxmlformats.org/drawingml/2006/main" xmlns:pic="http://schemas.openxmlformats.org/drawingml/2006/picture">
-            <wp:extent cx="5989320" cy="3496016"/>
+            <wp:extent cx="5989320" cy="3393415"/>
             <wp:docPr id="9" name="Picture 9"/>
             <wp:cNvGraphicFramePr>
               <a:graphicFrameLocks noChangeAspect="1"/>
@@ -918,7 +918,7 @@
                   <pic:spPr>
                     <a:xfrm>
                       <a:off x="0" y="0"/>
-                      <a:ext cx="5989320" cy="3496016"/>
+                      <a:ext cx="5989320" cy="3393415"/>
                     </a:xfrm>
                     <a:prstGeom prst="rect"/>
                   </pic:spPr>
@@ -995,7 +995,7 @@
       <w:r>
         <w:drawing>
           <wp:inline xmlns:a="http://schemas.openxmlformats.org/drawingml/2006/main" xmlns:pic="http://schemas.openxmlformats.org/drawingml/2006/picture">
-            <wp:extent cx="5989320" cy="3496016"/>
+            <wp:extent cx="5989320" cy="3393415"/>
             <wp:docPr id="10" name="Picture 10"/>
             <wp:cNvGraphicFramePr>
               <a:graphicFrameLocks noChangeAspect="1"/>
@@ -1016,7 +1016,7 @@
                   <pic:spPr>
                     <a:xfrm>
                       <a:off x="0" y="0"/>
-                      <a:ext cx="5989320" cy="3496016"/>
+                      <a:ext cx="5989320" cy="3393415"/>
                     </a:xfrm>
                     <a:prstGeom prst="rect"/>
                   </pic:spPr>
@@ -1093,7 +1093,7 @@
       <w:r>
         <w:drawing>
           <wp:inline xmlns:a="http://schemas.openxmlformats.org/drawingml/2006/main" xmlns:pic="http://schemas.openxmlformats.org/drawingml/2006/picture">
-            <wp:extent cx="5989320" cy="3496016"/>
+            <wp:extent cx="5989320" cy="3393415"/>
             <wp:docPr id="11" name="Picture 11"/>
             <wp:cNvGraphicFramePr>
               <a:graphicFrameLocks noChangeAspect="1"/>
@@ -1114,7 +1114,7 @@
                   <pic:spPr>
                     <a:xfrm>
                       <a:off x="0" y="0"/>
-                      <a:ext cx="5989320" cy="3496016"/>
+                      <a:ext cx="5989320" cy="3393415"/>
                     </a:xfrm>
                     <a:prstGeom prst="rect"/>
                   </pic:spPr>
@@ -1191,7 +1191,7 @@
       <w:r>
         <w:drawing>
           <wp:inline xmlns:a="http://schemas.openxmlformats.org/drawingml/2006/main" xmlns:pic="http://schemas.openxmlformats.org/drawingml/2006/picture">
-            <wp:extent cx="5989320" cy="3496016"/>
+            <wp:extent cx="5989320" cy="3393415"/>
             <wp:docPr id="12" name="Picture 12"/>
             <wp:cNvGraphicFramePr>
               <a:graphicFrameLocks noChangeAspect="1"/>
@@ -1212,7 +1212,7 @@
                   <pic:spPr>
                     <a:xfrm>
                       <a:off x="0" y="0"/>
-                      <a:ext cx="5989320" cy="3496016"/>
+                      <a:ext cx="5989320" cy="3393415"/>
                     </a:xfrm>
                     <a:prstGeom prst="rect"/>
                   </pic:spPr>
@@ -1289,7 +1289,7 @@
       <w:r>
         <w:drawing>
           <wp:inline xmlns:a="http://schemas.openxmlformats.org/drawingml/2006/main" xmlns:pic="http://schemas.openxmlformats.org/drawingml/2006/picture">
-            <wp:extent cx="5989320" cy="3496016"/>
+            <wp:extent cx="5989320" cy="3393415"/>
             <wp:docPr id="13" name="Picture 13"/>
             <wp:cNvGraphicFramePr>
               <a:graphicFrameLocks noChangeAspect="1"/>
@@ -1310,7 +1310,7 @@
                   <pic:spPr>
                     <a:xfrm>
                       <a:off x="0" y="0"/>
-                      <a:ext cx="5989320" cy="3496016"/>
+                      <a:ext cx="5989320" cy="3393415"/>
                     </a:xfrm>
                     <a:prstGeom prst="rect"/>
                   </pic:spPr>
@@ -1387,7 +1387,7 @@
       <w:r>
         <w:drawing>
           <wp:inline xmlns:a="http://schemas.openxmlformats.org/drawingml/2006/main" xmlns:pic="http://schemas.openxmlformats.org/drawingml/2006/picture">
-            <wp:extent cx="5989320" cy="3496016"/>
+            <wp:extent cx="5989320" cy="3393415"/>
             <wp:docPr id="14" name="Picture 14"/>
             <wp:cNvGraphicFramePr>
               <a:graphicFrameLocks noChangeAspect="1"/>
@@ -1408,7 +1408,7 @@
                   <pic:spPr>
                     <a:xfrm>
                       <a:off x="0" y="0"/>
-                      <a:ext cx="5989320" cy="3496016"/>
+                      <a:ext cx="5989320" cy="3393415"/>
                     </a:xfrm>
                     <a:prstGeom prst="rect"/>
                   </pic:spPr>
@@ -1485,7 +1485,7 @@
       <w:r>
         <w:drawing>
           <wp:inline xmlns:a="http://schemas.openxmlformats.org/drawingml/2006/main" xmlns:pic="http://schemas.openxmlformats.org/drawingml/2006/picture">
-            <wp:extent cx="5989320" cy="3496016"/>
+            <wp:extent cx="5989320" cy="3393415"/>
             <wp:docPr id="15" name="Picture 15"/>
             <wp:cNvGraphicFramePr>
               <a:graphicFrameLocks noChangeAspect="1"/>
@@ -1506,7 +1506,7 @@
                   <pic:spPr>
                     <a:xfrm>
                       <a:off x="0" y="0"/>
-                      <a:ext cx="5989320" cy="3496016"/>
+                      <a:ext cx="5989320" cy="3393415"/>
                     </a:xfrm>
                     <a:prstGeom prst="rect"/>
                   </pic:spPr>
@@ -1583,7 +1583,7 @@
       <w:r>
         <w:drawing>
           <wp:inline xmlns:a="http://schemas.openxmlformats.org/drawingml/2006/main" xmlns:pic="http://schemas.openxmlformats.org/drawingml/2006/picture">
-            <wp:extent cx="5989320" cy="3496016"/>
+            <wp:extent cx="5989320" cy="3393415"/>
             <wp:docPr id="16" name="Picture 16"/>
             <wp:cNvGraphicFramePr>
               <a:graphicFrameLocks noChangeAspect="1"/>
@@ -1604,7 +1604,7 @@
                   <pic:spPr>
                     <a:xfrm>
                       <a:off x="0" y="0"/>
-                      <a:ext cx="5989320" cy="3496016"/>
+                      <a:ext cx="5989320" cy="3393415"/>
                     </a:xfrm>
                     <a:prstGeom prst="rect"/>
                   </pic:spPr>
@@ -1681,7 +1681,7 @@
       <w:r>
         <w:drawing>
           <wp:inline xmlns:a="http://schemas.openxmlformats.org/drawingml/2006/main" xmlns:pic="http://schemas.openxmlformats.org/drawingml/2006/picture">
-            <wp:extent cx="5989320" cy="3496016"/>
+            <wp:extent cx="5989320" cy="3393415"/>
             <wp:docPr id="17" name="Picture 17"/>
             <wp:cNvGraphicFramePr>
               <a:graphicFrameLocks noChangeAspect="1"/>
@@ -1702,7 +1702,7 @@
                   <pic:spPr>
                     <a:xfrm>
                       <a:off x="0" y="0"/>
-                      <a:ext cx="5989320" cy="3496016"/>
+                      <a:ext cx="5989320" cy="3393415"/>
                     </a:xfrm>
                     <a:prstGeom prst="rect"/>
                   </pic:spPr>
@@ -1779,7 +1779,7 @@
       <w:r>
         <w:drawing>
           <wp:inline xmlns:a="http://schemas.openxmlformats.org/drawingml/2006/main" xmlns:pic="http://schemas.openxmlformats.org/drawingml/2006/picture">
-            <wp:extent cx="5989320" cy="3496016"/>
+            <wp:extent cx="5989320" cy="3393415"/>
             <wp:docPr id="18" name="Picture 18"/>
             <wp:cNvGraphicFramePr>
               <a:graphicFrameLocks noChangeAspect="1"/>
@@ -1800,7 +1800,7 @@
                   <pic:spPr>
                     <a:xfrm>
                       <a:off x="0" y="0"/>
-                      <a:ext cx="5989320" cy="3496016"/>
+                      <a:ext cx="5989320" cy="3393415"/>
                     </a:xfrm>
                     <a:prstGeom prst="rect"/>
                   </pic:spPr>
@@ -1877,7 +1877,7 @@
       <w:r>
         <w:drawing>
           <wp:inline xmlns:a="http://schemas.openxmlformats.org/drawingml/2006/main" xmlns:pic="http://schemas.openxmlformats.org/drawingml/2006/picture">
-            <wp:extent cx="5989320" cy="3496016"/>
+            <wp:extent cx="5989320" cy="3393415"/>
             <wp:docPr id="19" name="Picture 19"/>
             <wp:cNvGraphicFramePr>
               <a:graphicFrameLocks noChangeAspect="1"/>
@@ -1898,7 +1898,7 @@
                   <pic:spPr>
                     <a:xfrm>
                       <a:off x="0" y="0"/>
-                      <a:ext cx="5989320" cy="3496016"/>
+                      <a:ext cx="5989320" cy="3393415"/>
                     </a:xfrm>
                     <a:prstGeom prst="rect"/>
                   </pic:spPr>
@@ -1975,7 +1975,7 @@
       <w:r>
         <w:drawing>
           <wp:inline xmlns:a="http://schemas.openxmlformats.org/drawingml/2006/main" xmlns:pic="http://schemas.openxmlformats.org/drawingml/2006/picture">
-            <wp:extent cx="5989320" cy="3496016"/>
+            <wp:extent cx="5989320" cy="3393415"/>
             <wp:docPr id="20" name="Picture 20"/>
             <wp:cNvGraphicFramePr>
               <a:graphicFrameLocks noChangeAspect="1"/>
@@ -1996,7 +1996,7 @@
                   <pic:spPr>
                     <a:xfrm>
                       <a:off x="0" y="0"/>
-                      <a:ext cx="5989320" cy="3496016"/>
+                      <a:ext cx="5989320" cy="3393415"/>
                     </a:xfrm>
                     <a:prstGeom prst="rect"/>
                   </pic:spPr>

</xml_diff>